<commit_message>
Final changes before release.
</commit_message>
<xml_diff>
--- a/documentation/Mingzat-typesample.docx
+++ b/documentation/Mingzat-typesample.docx
@@ -45427,7 +45427,15 @@
         <w:szCs w:val="18"/>
         <w:lang w:val="en-US"/>
       </w:rPr>
-      <w:t>04</w:t>
+      <w:t>0</w:t>
+    </w:r>
+    <w:r>
+      <w:rPr>
+        <w:sz w:val="18"/>
+        <w:szCs w:val="18"/>
+        <w:lang w:val="en-US"/>
+      </w:rPr>
+      <w:t>5</w:t>
     </w:r>
     <w:r>
       <w:rPr>

</xml_diff>